<commit_message>
docs(PROFARMA): acréscimo de SP nos docs PLA, REQ e MED (v1.1 / v1.4 / v1.1)
- PLA v1.1: coluna SP Planejado adicionada à tabela §5.2 (19 sprints, total 573 SP)
- REQ v1.4: coluna SP Est. adicionada às tabelas RF-01 a RF-19 (total 294 SP)
- MED v1.1: métricas de Story Points acrescidas na §2.2
  (573 plan / 564 real / −1,6%; velocity ~30 SP/sprint)
- Docx regenerados para os três documentos

https://claude.ai/code/session_011KXfcc9u9SbkrrmomU4zNq
</commit_message>
<xml_diff>
--- a/mps-nivel-c/oficial/04_registros/PROFARMA_Cadastro-de-Clientes/MED-PROFARMA01-001_Registro-de-Medicao.docx
+++ b/mps-nivel-c/oficial/04_registros/PROFARMA_Cadastro-de-Clientes/MED-PROFARMA01-001_Registro-de-Medicao.docx
@@ -34,7 +34,7 @@
           <w:color w:val="555555"/>
           <w:sz w:val="20"/>
         </w:rPr>
-        <w:t>≥   ·   Versão Data   ·   05/06/2026   ·   Timeware Brasil</w:t>
+        <w:t>≥   ·   Versão Data   ·   10/06/2026   ·   Timeware Brasil</w:t>
       </w:r>
     </w:p>
     <w:p>
@@ -338,7 +338,7 @@
                 <w:i w:val="0"/>
                 <w:sz w:val="20"/>
               </w:rPr>
-              <w:t>1.0</w:t>
+              <w:t>1.1</w:t>
             </w:r>
           </w:p>
         </w:tc>
@@ -394,7 +394,7 @@
                 <w:i w:val="0"/>
                 <w:sz w:val="20"/>
               </w:rPr>
-              <w:t>05/06/2026</w:t>
+              <w:t>10/06/2026</w:t>
             </w:r>
           </w:p>
         </w:tc>
@@ -2019,6 +2019,249 @@
                 <w:sz w:val="20"/>
               </w:rPr>
               <w:t>+5 sprints (CRs e bloqueios de ambiente)</w:t>
+            </w:r>
+          </w:p>
+        </w:tc>
+      </w:tr>
+      <w:tr>
+        <w:trPr>
+          <w:cantSplit w:val="1"/>
+        </w:trPr>
+        <w:tc>
+          <w:tcPr>
+            <w:tcW w:type="dxa" w:w="2967"/>
+            <w:tcMar>
+              <w:top w:w="60" w:type="dxa"/>
+              <w:bottom w:w="60" w:type="dxa"/>
+              <w:left w:w="100" w:type="dxa"/>
+              <w:right w:w="100" w:type="dxa"/>
+            </w:tcMar>
+          </w:tcPr>
+          <w:p>
+            <w:pPr>
+              <w:spacing w:before="40" w:after="40"/>
+            </w:pPr>
+            <w:r>
+              <w:rPr>
+                <w:rFonts w:ascii="Calibri" w:hAnsi="Calibri"/>
+                <w:b w:val="0"/>
+                <w:i w:val="0"/>
+                <w:sz w:val="20"/>
+              </w:rPr>
+              <w:t>Story Points totais</w:t>
+            </w:r>
+          </w:p>
+        </w:tc>
+        <w:tc>
+          <w:tcPr>
+            <w:tcW w:type="dxa" w:w="2967"/>
+            <w:tcMar>
+              <w:top w:w="60" w:type="dxa"/>
+              <w:bottom w:w="60" w:type="dxa"/>
+              <w:left w:w="100" w:type="dxa"/>
+              <w:right w:w="100" w:type="dxa"/>
+            </w:tcMar>
+          </w:tcPr>
+          <w:p>
+            <w:pPr>
+              <w:spacing w:before="40" w:after="40"/>
+            </w:pPr>
+            <w:r>
+              <w:rPr>
+                <w:rFonts w:ascii="Calibri" w:hAnsi="Calibri"/>
+                <w:b w:val="0"/>
+                <w:i w:val="0"/>
+                <w:sz w:val="20"/>
+              </w:rPr>
+              <w:t>573 SP</w:t>
+            </w:r>
+          </w:p>
+        </w:tc>
+        <w:tc>
+          <w:tcPr>
+            <w:tcW w:type="dxa" w:w="2967"/>
+            <w:tcMar>
+              <w:top w:w="60" w:type="dxa"/>
+              <w:bottom w:w="60" w:type="dxa"/>
+              <w:left w:w="100" w:type="dxa"/>
+              <w:right w:w="100" w:type="dxa"/>
+            </w:tcMar>
+          </w:tcPr>
+          <w:p>
+            <w:pPr>
+              <w:spacing w:before="40" w:after="40"/>
+            </w:pPr>
+            <w:r>
+              <w:rPr>
+                <w:rFonts w:ascii="Calibri" w:hAnsi="Calibri"/>
+                <w:b w:val="0"/>
+                <w:i w:val="0"/>
+                <w:sz w:val="20"/>
+              </w:rPr>
+              <w:t>564 SP</w:t>
+            </w:r>
+          </w:p>
+        </w:tc>
+      </w:tr>
+      <w:tr>
+        <w:trPr>
+          <w:cantSplit w:val="1"/>
+        </w:trPr>
+        <w:tc>
+          <w:tcPr>
+            <w:tcW w:type="dxa" w:w="2967"/>
+            <w:tcMar>
+              <w:top w:w="60" w:type="dxa"/>
+              <w:bottom w:w="60" w:type="dxa"/>
+              <w:left w:w="100" w:type="dxa"/>
+              <w:right w:w="100" w:type="dxa"/>
+            </w:tcMar>
+            <w:shd w:val="clear" w:color="auto" w:fill="EBF5FB"/>
+          </w:tcPr>
+          <w:p>
+            <w:pPr>
+              <w:spacing w:before="40" w:after="40"/>
+            </w:pPr>
+            <w:r>
+              <w:rPr>
+                <w:rFonts w:ascii="Calibri" w:hAnsi="Calibri"/>
+                <w:b w:val="0"/>
+                <w:i w:val="0"/>
+                <w:sz w:val="20"/>
+              </w:rPr>
+              <w:t>Desvio de Story Points</w:t>
+            </w:r>
+          </w:p>
+        </w:tc>
+        <w:tc>
+          <w:tcPr>
+            <w:tcW w:type="dxa" w:w="2967"/>
+            <w:tcMar>
+              <w:top w:w="60" w:type="dxa"/>
+              <w:bottom w:w="60" w:type="dxa"/>
+              <w:left w:w="100" w:type="dxa"/>
+              <w:right w:w="100" w:type="dxa"/>
+            </w:tcMar>
+            <w:shd w:val="clear" w:color="auto" w:fill="EBF5FB"/>
+          </w:tcPr>
+          <w:p>
+            <w:pPr>
+              <w:spacing w:before="40" w:after="40"/>
+            </w:pPr>
+            <w:r>
+              <w:rPr>
+                <w:rFonts w:ascii="Calibri" w:hAnsi="Calibri"/>
+                <w:b w:val="0"/>
+                <w:i w:val="0"/>
+                <w:sz w:val="20"/>
+              </w:rPr>
+              <w:t>—</w:t>
+            </w:r>
+          </w:p>
+        </w:tc>
+        <w:tc>
+          <w:tcPr>
+            <w:tcW w:type="dxa" w:w="2967"/>
+            <w:tcMar>
+              <w:top w:w="60" w:type="dxa"/>
+              <w:bottom w:w="60" w:type="dxa"/>
+              <w:left w:w="100" w:type="dxa"/>
+              <w:right w:w="100" w:type="dxa"/>
+            </w:tcMar>
+            <w:shd w:val="clear" w:color="auto" w:fill="EBF5FB"/>
+          </w:tcPr>
+          <w:p>
+            <w:pPr>
+              <w:spacing w:before="40" w:after="40"/>
+            </w:pPr>
+            <w:r>
+              <w:rPr>
+                <w:rFonts w:ascii="Calibri" w:hAnsi="Calibri"/>
+                <w:b w:val="0"/>
+                <w:i w:val="0"/>
+                <w:sz w:val="20"/>
+              </w:rPr>
+              <w:t>−9 SP (−1,6%)</w:t>
+            </w:r>
+          </w:p>
+        </w:tc>
+      </w:tr>
+      <w:tr>
+        <w:trPr>
+          <w:cantSplit w:val="1"/>
+        </w:trPr>
+        <w:tc>
+          <w:tcPr>
+            <w:tcW w:type="dxa" w:w="2967"/>
+            <w:tcMar>
+              <w:top w:w="60" w:type="dxa"/>
+              <w:bottom w:w="60" w:type="dxa"/>
+              <w:left w:w="100" w:type="dxa"/>
+              <w:right w:w="100" w:type="dxa"/>
+            </w:tcMar>
+          </w:tcPr>
+          <w:p>
+            <w:pPr>
+              <w:spacing w:before="40" w:after="40"/>
+            </w:pPr>
+            <w:r>
+              <w:rPr>
+                <w:rFonts w:ascii="Calibri" w:hAnsi="Calibri"/>
+                <w:b w:val="0"/>
+                <w:i w:val="0"/>
+                <w:sz w:val="20"/>
+              </w:rPr>
+              <w:t>Velocity média por sprint</w:t>
+            </w:r>
+          </w:p>
+        </w:tc>
+        <w:tc>
+          <w:tcPr>
+            <w:tcW w:type="dxa" w:w="2967"/>
+            <w:tcMar>
+              <w:top w:w="60" w:type="dxa"/>
+              <w:bottom w:w="60" w:type="dxa"/>
+              <w:left w:w="100" w:type="dxa"/>
+              <w:right w:w="100" w:type="dxa"/>
+            </w:tcMar>
+          </w:tcPr>
+          <w:p>
+            <w:pPr>
+              <w:spacing w:before="40" w:after="40"/>
+            </w:pPr>
+            <w:r>
+              <w:rPr>
+                <w:rFonts w:ascii="Calibri" w:hAnsi="Calibri"/>
+                <w:b w:val="0"/>
+                <w:i w:val="0"/>
+                <w:sz w:val="20"/>
+              </w:rPr>
+              <w:t>—</w:t>
+            </w:r>
+          </w:p>
+        </w:tc>
+        <w:tc>
+          <w:tcPr>
+            <w:tcW w:type="dxa" w:w="2967"/>
+            <w:tcMar>
+              <w:top w:w="60" w:type="dxa"/>
+              <w:bottom w:w="60" w:type="dxa"/>
+              <w:left w:w="100" w:type="dxa"/>
+              <w:right w:w="100" w:type="dxa"/>
+            </w:tcMar>
+          </w:tcPr>
+          <w:p>
+            <w:pPr>
+              <w:spacing w:before="40" w:after="40"/>
+            </w:pPr>
+            <w:r>
+              <w:rPr>
+                <w:rFonts w:ascii="Calibri" w:hAnsi="Calibri"/>
+                <w:b w:val="0"/>
+                <w:i w:val="0"/>
+                <w:sz w:val="20"/>
+              </w:rPr>
+              <w:t>~30 SP/sprint (pico: 42 SP no Sprint 16)</w:t>
             </w:r>
           </w:p>
         </w:tc>
@@ -5397,6 +5640,112 @@
           </w:p>
         </w:tc>
       </w:tr>
+      <w:tr>
+        <w:trPr>
+          <w:cantSplit w:val="1"/>
+        </w:trPr>
+        <w:tc>
+          <w:tcPr>
+            <w:tcW w:type="dxa" w:w="2225"/>
+            <w:tcMar>
+              <w:top w:w="60" w:type="dxa"/>
+              <w:bottom w:w="60" w:type="dxa"/>
+              <w:left w:w="100" w:type="dxa"/>
+              <w:right w:w="100" w:type="dxa"/>
+            </w:tcMar>
+            <w:shd w:val="clear" w:color="auto" w:fill="F0F4F8"/>
+          </w:tcPr>
+          <w:p>
+            <w:pPr>
+              <w:spacing w:before="40" w:after="40"/>
+            </w:pPr>
+            <w:r>
+              <w:rPr>
+                <w:rFonts w:ascii="Calibri" w:hAnsi="Calibri"/>
+                <w:b/>
+                <w:i w:val="0"/>
+                <w:sz w:val="20"/>
+              </w:rPr>
+              <w:t>1.1</w:t>
+            </w:r>
+          </w:p>
+        </w:tc>
+        <w:tc>
+          <w:tcPr>
+            <w:tcW w:type="dxa" w:w="2225"/>
+            <w:tcMar>
+              <w:top w:w="60" w:type="dxa"/>
+              <w:bottom w:w="60" w:type="dxa"/>
+              <w:left w:w="100" w:type="dxa"/>
+              <w:right w:w="100" w:type="dxa"/>
+            </w:tcMar>
+          </w:tcPr>
+          <w:p>
+            <w:pPr>
+              <w:spacing w:before="40" w:after="40"/>
+            </w:pPr>
+            <w:r>
+              <w:rPr>
+                <w:rFonts w:ascii="Calibri" w:hAnsi="Calibri"/>
+                <w:b w:val="0"/>
+                <w:i w:val="0"/>
+                <w:sz w:val="20"/>
+              </w:rPr>
+              <w:t>10/06/2026</w:t>
+            </w:r>
+          </w:p>
+        </w:tc>
+        <w:tc>
+          <w:tcPr>
+            <w:tcW w:type="dxa" w:w="2225"/>
+            <w:tcMar>
+              <w:top w:w="60" w:type="dxa"/>
+              <w:bottom w:w="60" w:type="dxa"/>
+              <w:left w:w="100" w:type="dxa"/>
+              <w:right w:w="100" w:type="dxa"/>
+            </w:tcMar>
+          </w:tcPr>
+          <w:p>
+            <w:pPr>
+              <w:spacing w:before="40" w:after="40"/>
+            </w:pPr>
+            <w:r>
+              <w:rPr>
+                <w:rFonts w:ascii="Calibri" w:hAnsi="Calibri"/>
+                <w:b w:val="0"/>
+                <w:i w:val="0"/>
+                <w:sz w:val="20"/>
+              </w:rPr>
+              <w:t>Time de Melhoria Contínua</w:t>
+            </w:r>
+          </w:p>
+        </w:tc>
+        <w:tc>
+          <w:tcPr>
+            <w:tcW w:type="dxa" w:w="2225"/>
+            <w:tcMar>
+              <w:top w:w="60" w:type="dxa"/>
+              <w:bottom w:w="60" w:type="dxa"/>
+              <w:left w:w="100" w:type="dxa"/>
+              <w:right w:w="100" w:type="dxa"/>
+            </w:tcMar>
+          </w:tcPr>
+          <w:p>
+            <w:pPr>
+              <w:spacing w:before="40" w:after="40"/>
+            </w:pPr>
+            <w:r>
+              <w:rPr>
+                <w:rFonts w:ascii="Calibri" w:hAnsi="Calibri"/>
+                <w:b w:val="0"/>
+                <w:i w:val="0"/>
+                <w:sz w:val="20"/>
+              </w:rPr>
+              <w:t>Acréscimo das métricas de Story Points na §2.2 (573 SP plan / 564 SP real / −1,6%; velocity ~30 SP/sprint) para consistência com a planilha de gestão do projeto</w:t>
+            </w:r>
+          </w:p>
+        </w:tc>
+      </w:tr>
     </w:tbl>
     <w:p>
       <w:pPr>
@@ -5437,7 +5786,7 @@
         <w:color w:val="555555"/>
         <w:sz w:val="16"/>
       </w:rPr>
-      <w:t>vData  ·  05/06/2026</w:t>
+      <w:t>vData  ·  10/06/2026</w:t>
     </w:r>
     <w:r>
       <w:tab/>
@@ -5499,7 +5848,7 @@
         <w:color w:val="555555"/>
         <w:sz w:val="16"/>
       </w:rPr>
-      <w:t>vData  ·  05/06/2026</w:t>
+      <w:t>vData  ·  10/06/2026</w:t>
     </w:r>
     <w:r>
       <w:tab/>

</xml_diff>